<commit_message>
Barranquita: caratula con SERVICIO DE DISEÑO - DRENAJE PLUVIAL en lugar de EXPEDIENTE TÉCNICO
Co-Authored-By: Claude Opus 5.5 <noreply@anthropic.com>
Claude-Session: https://claude.ai/code/session_0142t8T16igb3VKxUPwnQPq6
</commit_message>
<xml_diff>
--- a/entregables_barranquita/CARATULAS_DRENAJE_PLUVIAL_IE0590_BARRANQUITA.docx
+++ b/entregables_barranquita/CARATULAS_DRENAJE_PLUVIAL_IE0590_BARRANQUITA.docx
@@ -47,7 +47,7 @@
           <w:color w:val="1F3A68"/>
           <w:sz w:val="24"/>
         </w:rPr>
-        <w:t>EXPEDIENTE TÉCNICO</w:t>
+        <w:t>SERVICIO DE DISEÑO - DRENAJE PLUVIAL</w:t>
       </w:r>
     </w:p>
     <w:p>
@@ -274,7 +274,7 @@
           <w:color w:val="1F3A68"/>
           <w:sz w:val="24"/>
         </w:rPr>
-        <w:t>EXPEDIENTE TÉCNICO</w:t>
+        <w:t>SERVICIO DE DISEÑO - DRENAJE PLUVIAL</w:t>
       </w:r>
     </w:p>
     <w:p>
@@ -501,7 +501,7 @@
           <w:color w:val="1F3A68"/>
           <w:sz w:val="24"/>
         </w:rPr>
-        <w:t>EXPEDIENTE TÉCNICO</w:t>
+        <w:t>SERVICIO DE DISEÑO - DRENAJE PLUVIAL</w:t>
       </w:r>
     </w:p>
     <w:p>
@@ -728,7 +728,7 @@
           <w:color w:val="1F3A68"/>
           <w:sz w:val="24"/>
         </w:rPr>
-        <w:t>EXPEDIENTE TÉCNICO</w:t>
+        <w:t>SERVICIO DE DISEÑO - DRENAJE PLUVIAL</w:t>
       </w:r>
     </w:p>
     <w:p>
@@ -955,7 +955,7 @@
           <w:color w:val="1F3A68"/>
           <w:sz w:val="24"/>
         </w:rPr>
-        <w:t>EXPEDIENTE TÉCNICO</w:t>
+        <w:t>SERVICIO DE DISEÑO - DRENAJE PLUVIAL</w:t>
       </w:r>
     </w:p>
     <w:p>
@@ -1182,7 +1182,7 @@
           <w:color w:val="1F3A68"/>
           <w:sz w:val="24"/>
         </w:rPr>
-        <w:t>EXPEDIENTE TÉCNICO</w:t>
+        <w:t>SERVICIO DE DISEÑO - DRENAJE PLUVIAL</w:t>
       </w:r>
     </w:p>
     <w:p>

</xml_diff>